<commit_message>
Ny obligatorisk del 3 (ideologierna), gatunamnsfrågan blir frivillig del 4
- Del 3 i båda proven: välj en ideologi, förklara varför den växte fram och
  koppla till i dag (E-nivå; Gy25 1a/1b/2, Gy11 1a/1b/1d/2)
- Gatunamnsfrågan (historiebruk) flyttad till de frivilliga delarna
- Varning när ett mål bara prövas i frivilliga delar
- Skrivraderna syns nu var för sig i Word och PDF (w:between)
- Proven ombyggda med PDF; SAMMANFATTNING.md uppdaterad

Co-Authored-By: Claude Opus 5.5 <noreply@anthropic.com>
Claude-Session: https://claude.ai/code/session_01XK5P1PHwjc1RghiHGkL9YZ
</commit_message>
<xml_diff>
--- a/prov/det-langa-1800-talet-gy11/det-langa-1800-talet-gy11_elev.docx
+++ b/prov/det-langa-1800-talet-gy11/det-langa-1800-talet-gy11_elev.docx
@@ -35,6 +35,7 @@
               <w:spacing w:line="480" w:lineRule="exact"/>
               <w:pBdr>
                 <w:bottom w:val="single" w:sz="4" w:space="1" w:color="808080"/>
+                <w:between w:val="single" w:sz="4" w:space="1" w:color="808080"/>
               </w:pBdr>
             </w:pPr>
             <w:r>
@@ -54,6 +55,7 @@
               <w:spacing w:line="480" w:lineRule="exact"/>
               <w:pBdr>
                 <w:bottom w:val="single" w:sz="4" w:space="1" w:color="808080"/>
+                <w:between w:val="single" w:sz="4" w:space="1" w:color="808080"/>
               </w:pBdr>
             </w:pPr>
             <w:r>
@@ -71,6 +73,19 @@
         <w:keepNext w:val="0"/>
         <w:spacing w:before="0" w:after="80"/>
       </w:pPr>
+    </w:p>
+    <w:p>
+      <w:pPr>
+        <w:keepNext w:val="0"/>
+        <w:spacing w:before="0" w:after="120"/>
+      </w:pPr>
+      <w:r>
+        <w:rPr>
+          <w:b w:val="0"/>
+          <w:sz w:val="21"/>
+        </w:rPr>
+        <w:t>Del 1–3 är obligatoriska och kan tillsammans ge betyget E. Del 4–6 är frivilliga. Där kan du visa kunskaper för C och A. Svara på så mycket du kan. Du kan lämna in även om du inte har svarat på allt.</w:t>
+      </w:r>
     </w:p>
     <w:p>
       <w:pPr>
@@ -910,6 +925,7 @@
         <w:spacing w:line="520" w:lineRule="exact" w:after="0"/>
         <w:pBdr>
           <w:bottom w:val="single" w:sz="4" w:space="1" w:color="808080"/>
+          <w:between w:val="single" w:sz="4" w:space="1" w:color="808080"/>
         </w:pBdr>
       </w:pPr>
       <w:r>
@@ -925,6 +941,7 @@
         <w:spacing w:line="520" w:lineRule="exact" w:after="0"/>
         <w:pBdr>
           <w:bottom w:val="single" w:sz="4" w:space="1" w:color="808080"/>
+          <w:between w:val="single" w:sz="4" w:space="1" w:color="808080"/>
         </w:pBdr>
       </w:pPr>
     </w:p>
@@ -933,6 +950,7 @@
         <w:spacing w:line="520" w:lineRule="exact" w:after="0"/>
         <w:pBdr>
           <w:bottom w:val="single" w:sz="4" w:space="1" w:color="808080"/>
+          <w:between w:val="single" w:sz="4" w:space="1" w:color="808080"/>
         </w:pBdr>
       </w:pPr>
     </w:p>
@@ -948,6 +966,7 @@
         <w:spacing w:line="520" w:lineRule="exact" w:after="0"/>
         <w:pBdr>
           <w:bottom w:val="single" w:sz="4" w:space="1" w:color="808080"/>
+          <w:between w:val="single" w:sz="4" w:space="1" w:color="808080"/>
         </w:pBdr>
       </w:pPr>
       <w:r>
@@ -963,6 +982,7 @@
         <w:spacing w:line="520" w:lineRule="exact" w:after="0"/>
         <w:pBdr>
           <w:bottom w:val="single" w:sz="4" w:space="1" w:color="808080"/>
+          <w:between w:val="single" w:sz="4" w:space="1" w:color="808080"/>
         </w:pBdr>
       </w:pPr>
     </w:p>
@@ -971,6 +991,7 @@
         <w:spacing w:line="520" w:lineRule="exact" w:after="0"/>
         <w:pBdr>
           <w:bottom w:val="single" w:sz="4" w:space="1" w:color="808080"/>
+          <w:between w:val="single" w:sz="4" w:space="1" w:color="808080"/>
         </w:pBdr>
       </w:pPr>
     </w:p>
@@ -986,6 +1007,7 @@
         <w:spacing w:line="520" w:lineRule="exact" w:after="0"/>
         <w:pBdr>
           <w:bottom w:val="single" w:sz="4" w:space="1" w:color="808080"/>
+          <w:between w:val="single" w:sz="4" w:space="1" w:color="808080"/>
         </w:pBdr>
       </w:pPr>
       <w:r>
@@ -1001,6 +1023,7 @@
         <w:spacing w:line="520" w:lineRule="exact" w:after="0"/>
         <w:pBdr>
           <w:bottom w:val="single" w:sz="4" w:space="1" w:color="808080"/>
+          <w:between w:val="single" w:sz="4" w:space="1" w:color="808080"/>
         </w:pBdr>
       </w:pPr>
     </w:p>
@@ -1009,6 +1032,7 @@
         <w:spacing w:line="520" w:lineRule="exact" w:after="0"/>
         <w:pBdr>
           <w:bottom w:val="single" w:sz="4" w:space="1" w:color="808080"/>
+          <w:between w:val="single" w:sz="4" w:space="1" w:color="808080"/>
         </w:pBdr>
       </w:pPr>
     </w:p>
@@ -1024,6 +1048,7 @@
         <w:spacing w:line="520" w:lineRule="exact" w:after="0"/>
         <w:pBdr>
           <w:bottom w:val="single" w:sz="4" w:space="1" w:color="808080"/>
+          <w:between w:val="single" w:sz="4" w:space="1" w:color="808080"/>
         </w:pBdr>
       </w:pPr>
       <w:r>
@@ -1039,6 +1064,7 @@
         <w:spacing w:line="520" w:lineRule="exact" w:after="0"/>
         <w:pBdr>
           <w:bottom w:val="single" w:sz="4" w:space="1" w:color="808080"/>
+          <w:between w:val="single" w:sz="4" w:space="1" w:color="808080"/>
         </w:pBdr>
       </w:pPr>
     </w:p>
@@ -1047,6 +1073,7 @@
         <w:spacing w:line="520" w:lineRule="exact" w:after="0"/>
         <w:pBdr>
           <w:bottom w:val="single" w:sz="4" w:space="1" w:color="808080"/>
+          <w:between w:val="single" w:sz="4" w:space="1" w:color="808080"/>
         </w:pBdr>
       </w:pPr>
     </w:p>
@@ -1062,6 +1089,7 @@
         <w:spacing w:line="520" w:lineRule="exact" w:after="0"/>
         <w:pBdr>
           <w:bottom w:val="single" w:sz="4" w:space="1" w:color="808080"/>
+          <w:between w:val="single" w:sz="4" w:space="1" w:color="808080"/>
         </w:pBdr>
       </w:pPr>
       <w:r>
@@ -1077,6 +1105,7 @@
         <w:spacing w:line="520" w:lineRule="exact" w:after="0"/>
         <w:pBdr>
           <w:bottom w:val="single" w:sz="4" w:space="1" w:color="808080"/>
+          <w:between w:val="single" w:sz="4" w:space="1" w:color="808080"/>
         </w:pBdr>
       </w:pPr>
     </w:p>
@@ -1085,6 +1114,7 @@
         <w:spacing w:line="520" w:lineRule="exact" w:after="0"/>
         <w:pBdr>
           <w:bottom w:val="single" w:sz="4" w:space="1" w:color="808080"/>
+          <w:between w:val="single" w:sz="4" w:space="1" w:color="808080"/>
         </w:pBdr>
       </w:pPr>
     </w:p>
@@ -1098,7 +1128,7 @@
           <w:b/>
           <w:sz w:val="25"/>
         </w:rPr>
-        <w:t>3. I Paris finns gator och platser som är uppkallade efter Napoleon och hans segrar, till exempel Rue Austerlitz och Avenue de Wagram. Varför tror du att man har valt att minnas Napoleon på det sättet? Ge också ett exempel på hur historia används på ett liknande sätt i dag.</w:t>
+        <w:t>3. Under 1800-talet växte nya ideologier fram. Välj liberalismen, konservatismen eller socialismen. Förklara varför ideologin växte fram och vad den ville förändra eller bevara. Ge också ett exempel på hur ideologin syns i samhället i dag. Använd begreppen orsak och konsekvens.</w:t>
       </w:r>
     </w:p>
     <w:p>
@@ -1113,6 +1143,7 @@
         <w:spacing w:line="520" w:lineRule="exact" w:after="0"/>
         <w:pBdr>
           <w:bottom w:val="single" w:sz="4" w:space="1" w:color="808080"/>
+          <w:between w:val="single" w:sz="4" w:space="1" w:color="808080"/>
         </w:pBdr>
       </w:pPr>
     </w:p>
@@ -1122,6 +1153,7 @@
         <w:spacing w:line="520" w:lineRule="exact" w:after="0"/>
         <w:pBdr>
           <w:bottom w:val="single" w:sz="4" w:space="1" w:color="808080"/>
+          <w:between w:val="single" w:sz="4" w:space="1" w:color="808080"/>
         </w:pBdr>
       </w:pPr>
     </w:p>
@@ -1131,6 +1163,7 @@
         <w:spacing w:line="520" w:lineRule="exact" w:after="0"/>
         <w:pBdr>
           <w:bottom w:val="single" w:sz="4" w:space="1" w:color="808080"/>
+          <w:between w:val="single" w:sz="4" w:space="1" w:color="808080"/>
         </w:pBdr>
       </w:pPr>
     </w:p>
@@ -1140,6 +1173,7 @@
         <w:spacing w:line="520" w:lineRule="exact" w:after="0"/>
         <w:pBdr>
           <w:bottom w:val="single" w:sz="4" w:space="1" w:color="808080"/>
+          <w:between w:val="single" w:sz="4" w:space="1" w:color="808080"/>
         </w:pBdr>
       </w:pPr>
     </w:p>
@@ -1149,6 +1183,7 @@
         <w:spacing w:line="520" w:lineRule="exact" w:after="0"/>
         <w:pBdr>
           <w:bottom w:val="single" w:sz="4" w:space="1" w:color="808080"/>
+          <w:between w:val="single" w:sz="4" w:space="1" w:color="808080"/>
         </w:pBdr>
       </w:pPr>
     </w:p>
@@ -1158,6 +1193,7 @@
         <w:spacing w:line="520" w:lineRule="exact" w:after="0"/>
         <w:pBdr>
           <w:bottom w:val="single" w:sz="4" w:space="1" w:color="808080"/>
+          <w:between w:val="single" w:sz="4" w:space="1" w:color="808080"/>
         </w:pBdr>
       </w:pPr>
     </w:p>
@@ -1167,6 +1203,7 @@
         <w:spacing w:line="520" w:lineRule="exact" w:after="0"/>
         <w:pBdr>
           <w:bottom w:val="single" w:sz="4" w:space="1" w:color="808080"/>
+          <w:between w:val="single" w:sz="4" w:space="1" w:color="808080"/>
         </w:pBdr>
       </w:pPr>
     </w:p>
@@ -1175,6 +1212,7 @@
         <w:spacing w:line="520" w:lineRule="exact" w:after="0"/>
         <w:pBdr>
           <w:bottom w:val="single" w:sz="4" w:space="1" w:color="808080"/>
+          <w:between w:val="single" w:sz="4" w:space="1" w:color="808080"/>
         </w:pBdr>
       </w:pPr>
     </w:p>
@@ -1193,7 +1231,34 @@
           <w:b/>
           <w:sz w:val="25"/>
         </w:rPr>
-        <w:t>4. Den franska revolutionen brukar ses som början på det långa 1800-talet. Vilka var orsakerna till revolutionen, och vilka konsekvenser fick den för Frankrike och Europa på kort och på lång sikt? Använd begreppen orsak och konsekvens samt kontinuitet och förändring i ditt svar.</w:t>
+        <w:t>Frivilliga delar: här kan du visa kunskaper för C och A</w:t>
+      </w:r>
+    </w:p>
+    <w:p>
+      <w:pPr>
+        <w:keepNext w:val="0"/>
+        <w:spacing w:before="0" w:after="200"/>
+      </w:pPr>
+      <w:r>
+        <w:rPr>
+          <w:b w:val="0"/>
+          <w:color w:val="555555"/>
+          <w:sz w:val="21"/>
+        </w:rPr>
+        <w:t>Fortsätt om du vill och orkar. Det du har svarat på i de obligatoriska delarna gäller ändå.</w:t>
+      </w:r>
+    </w:p>
+    <w:p>
+      <w:pPr>
+        <w:keepNext/>
+        <w:spacing w:before="440" w:after="120"/>
+      </w:pPr>
+      <w:r>
+        <w:rPr>
+          <w:b/>
+          <w:sz w:val="25"/>
+        </w:rPr>
+        <w:t>4. I Paris finns gator och platser som är uppkallade efter Napoleon och hans segrar, till exempel Rue Austerlitz och Avenue de Wagram. Varför tror du att man har valt att minnas Napoleon på det sättet? Ge också ett exempel på hur historia används på ett liknande sätt i dag.</w:t>
       </w:r>
     </w:p>
     <w:p>
@@ -1208,6 +1273,7 @@
         <w:spacing w:line="520" w:lineRule="exact" w:after="0"/>
         <w:pBdr>
           <w:bottom w:val="single" w:sz="4" w:space="1" w:color="808080"/>
+          <w:between w:val="single" w:sz="4" w:space="1" w:color="808080"/>
         </w:pBdr>
       </w:pPr>
     </w:p>
@@ -1217,6 +1283,7 @@
         <w:spacing w:line="520" w:lineRule="exact" w:after="0"/>
         <w:pBdr>
           <w:bottom w:val="single" w:sz="4" w:space="1" w:color="808080"/>
+          <w:between w:val="single" w:sz="4" w:space="1" w:color="808080"/>
         </w:pBdr>
       </w:pPr>
     </w:p>
@@ -1226,6 +1293,7 @@
         <w:spacing w:line="520" w:lineRule="exact" w:after="0"/>
         <w:pBdr>
           <w:bottom w:val="single" w:sz="4" w:space="1" w:color="808080"/>
+          <w:between w:val="single" w:sz="4" w:space="1" w:color="808080"/>
         </w:pBdr>
       </w:pPr>
     </w:p>
@@ -1235,6 +1303,7 @@
         <w:spacing w:line="520" w:lineRule="exact" w:after="0"/>
         <w:pBdr>
           <w:bottom w:val="single" w:sz="4" w:space="1" w:color="808080"/>
+          <w:between w:val="single" w:sz="4" w:space="1" w:color="808080"/>
         </w:pBdr>
       </w:pPr>
     </w:p>
@@ -1244,6 +1313,7 @@
         <w:spacing w:line="520" w:lineRule="exact" w:after="0"/>
         <w:pBdr>
           <w:bottom w:val="single" w:sz="4" w:space="1" w:color="808080"/>
+          <w:between w:val="single" w:sz="4" w:space="1" w:color="808080"/>
         </w:pBdr>
       </w:pPr>
     </w:p>
@@ -1253,6 +1323,7 @@
         <w:spacing w:line="520" w:lineRule="exact" w:after="0"/>
         <w:pBdr>
           <w:bottom w:val="single" w:sz="4" w:space="1" w:color="808080"/>
+          <w:between w:val="single" w:sz="4" w:space="1" w:color="808080"/>
         </w:pBdr>
       </w:pPr>
     </w:p>
@@ -1262,158 +1333,16 @@
         <w:spacing w:line="520" w:lineRule="exact" w:after="0"/>
         <w:pBdr>
           <w:bottom w:val="single" w:sz="4" w:space="1" w:color="808080"/>
+          <w:between w:val="single" w:sz="4" w:space="1" w:color="808080"/>
         </w:pBdr>
       </w:pPr>
     </w:p>
     <w:p>
       <w:pPr>
-        <w:keepNext/>
         <w:spacing w:line="520" w:lineRule="exact" w:after="0"/>
         <w:pBdr>
           <w:bottom w:val="single" w:sz="4" w:space="1" w:color="808080"/>
-        </w:pBdr>
-      </w:pPr>
-    </w:p>
-    <w:p>
-      <w:pPr>
-        <w:keepNext/>
-        <w:spacing w:line="520" w:lineRule="exact" w:after="0"/>
-        <w:pBdr>
-          <w:bottom w:val="single" w:sz="4" w:space="1" w:color="808080"/>
-        </w:pBdr>
-      </w:pPr>
-    </w:p>
-    <w:p>
-      <w:pPr>
-        <w:keepNext/>
-        <w:spacing w:line="520" w:lineRule="exact" w:after="0"/>
-        <w:pBdr>
-          <w:bottom w:val="single" w:sz="4" w:space="1" w:color="808080"/>
-        </w:pBdr>
-      </w:pPr>
-    </w:p>
-    <w:p>
-      <w:pPr>
-        <w:keepNext/>
-        <w:spacing w:line="520" w:lineRule="exact" w:after="0"/>
-        <w:pBdr>
-          <w:bottom w:val="single" w:sz="4" w:space="1" w:color="808080"/>
-        </w:pBdr>
-      </w:pPr>
-    </w:p>
-    <w:p>
-      <w:pPr>
-        <w:keepNext/>
-        <w:spacing w:line="520" w:lineRule="exact" w:after="0"/>
-        <w:pBdr>
-          <w:bottom w:val="single" w:sz="4" w:space="1" w:color="808080"/>
-        </w:pBdr>
-      </w:pPr>
-    </w:p>
-    <w:p>
-      <w:pPr>
-        <w:keepNext/>
-        <w:spacing w:line="520" w:lineRule="exact" w:after="0"/>
-        <w:pBdr>
-          <w:bottom w:val="single" w:sz="4" w:space="1" w:color="808080"/>
-        </w:pBdr>
-      </w:pPr>
-    </w:p>
-    <w:p>
-      <w:pPr>
-        <w:keepNext/>
-        <w:spacing w:line="520" w:lineRule="exact" w:after="0"/>
-        <w:pBdr>
-          <w:bottom w:val="single" w:sz="4" w:space="1" w:color="808080"/>
-        </w:pBdr>
-      </w:pPr>
-    </w:p>
-    <w:p>
-      <w:pPr>
-        <w:keepNext/>
-        <w:spacing w:line="520" w:lineRule="exact" w:after="0"/>
-        <w:pBdr>
-          <w:bottom w:val="single" w:sz="4" w:space="1" w:color="808080"/>
-        </w:pBdr>
-      </w:pPr>
-    </w:p>
-    <w:p>
-      <w:pPr>
-        <w:keepNext/>
-        <w:spacing w:line="520" w:lineRule="exact" w:after="0"/>
-        <w:pBdr>
-          <w:bottom w:val="single" w:sz="4" w:space="1" w:color="808080"/>
-        </w:pBdr>
-      </w:pPr>
-    </w:p>
-    <w:p>
-      <w:pPr>
-        <w:keepNext/>
-        <w:spacing w:line="520" w:lineRule="exact" w:after="0"/>
-        <w:pBdr>
-          <w:bottom w:val="single" w:sz="4" w:space="1" w:color="808080"/>
-        </w:pBdr>
-      </w:pPr>
-    </w:p>
-    <w:p>
-      <w:pPr>
-        <w:keepNext/>
-        <w:spacing w:line="520" w:lineRule="exact" w:after="0"/>
-        <w:pBdr>
-          <w:bottom w:val="single" w:sz="4" w:space="1" w:color="808080"/>
-        </w:pBdr>
-      </w:pPr>
-    </w:p>
-    <w:p>
-      <w:pPr>
-        <w:keepNext/>
-        <w:spacing w:line="520" w:lineRule="exact" w:after="0"/>
-        <w:pBdr>
-          <w:bottom w:val="single" w:sz="4" w:space="1" w:color="808080"/>
-        </w:pBdr>
-      </w:pPr>
-    </w:p>
-    <w:p>
-      <w:pPr>
-        <w:keepNext/>
-        <w:spacing w:line="520" w:lineRule="exact" w:after="0"/>
-        <w:pBdr>
-          <w:bottom w:val="single" w:sz="4" w:space="1" w:color="808080"/>
-        </w:pBdr>
-      </w:pPr>
-    </w:p>
-    <w:p>
-      <w:pPr>
-        <w:keepNext/>
-        <w:spacing w:line="520" w:lineRule="exact" w:after="0"/>
-        <w:pBdr>
-          <w:bottom w:val="single" w:sz="4" w:space="1" w:color="808080"/>
-        </w:pBdr>
-      </w:pPr>
-    </w:p>
-    <w:p>
-      <w:pPr>
-        <w:keepNext/>
-        <w:spacing w:line="520" w:lineRule="exact" w:after="0"/>
-        <w:pBdr>
-          <w:bottom w:val="single" w:sz="4" w:space="1" w:color="808080"/>
-        </w:pBdr>
-      </w:pPr>
-    </w:p>
-    <w:p>
-      <w:pPr>
-        <w:keepNext/>
-        <w:spacing w:line="520" w:lineRule="exact" w:after="0"/>
-        <w:pBdr>
-          <w:bottom w:val="single" w:sz="4" w:space="1" w:color="808080"/>
-        </w:pBdr>
-      </w:pPr>
-    </w:p>
-    <w:p>
-      <w:pPr>
-        <w:spacing w:line="520" w:lineRule="exact" w:after="0"/>
-        <w:pBdr>
-          <w:bottom w:val="single" w:sz="4" w:space="1" w:color="808080"/>
+          <w:between w:val="single" w:sz="4" w:space="1" w:color="808080"/>
         </w:pBdr>
       </w:pPr>
     </w:p>
@@ -1432,7 +1361,7 @@
           <w:b/>
           <w:sz w:val="25"/>
         </w:rPr>
-        <w:t>5. Historiker förklarar Tysklands enande på olika sätt. Vissa menar att enandet inte hade skett utan Otto von Bismarck (aktörsperspektiv). Andra menar att det berodde på omständigheterna i tiden, till exempel Preussens styrka och nationalismen (strukturperspektiv). Redogör för hur Tyskland enades. Jämför sedan de två förklaringarna och motivera vilken du tycker är mest övertygande. Avsluta med att resonera om vilka konsekvenser enandet fick för Europa. Använd begreppen orsak, konsekvens, aktör och struktur i ditt svar.</w:t>
+        <w:t>5. Den franska revolutionen brukar ses som början på det långa 1800-talet. Vilka var orsakerna till revolutionen, och vilka konsekvenser fick den för Frankrike och Europa på kort och på lång sikt? Använd begreppen orsak och konsekvens samt kontinuitet och förändring i ditt svar.</w:t>
       </w:r>
     </w:p>
     <w:p>
@@ -1447,6 +1376,7 @@
         <w:spacing w:line="520" w:lineRule="exact" w:after="0"/>
         <w:pBdr>
           <w:bottom w:val="single" w:sz="4" w:space="1" w:color="808080"/>
+          <w:between w:val="single" w:sz="4" w:space="1" w:color="808080"/>
         </w:pBdr>
       </w:pPr>
     </w:p>
@@ -1456,6 +1386,7 @@
         <w:spacing w:line="520" w:lineRule="exact" w:after="0"/>
         <w:pBdr>
           <w:bottom w:val="single" w:sz="4" w:space="1" w:color="808080"/>
+          <w:between w:val="single" w:sz="4" w:space="1" w:color="808080"/>
         </w:pBdr>
       </w:pPr>
     </w:p>
@@ -1465,6 +1396,7 @@
         <w:spacing w:line="520" w:lineRule="exact" w:after="0"/>
         <w:pBdr>
           <w:bottom w:val="single" w:sz="4" w:space="1" w:color="808080"/>
+          <w:between w:val="single" w:sz="4" w:space="1" w:color="808080"/>
         </w:pBdr>
       </w:pPr>
     </w:p>
@@ -1474,6 +1406,7 @@
         <w:spacing w:line="520" w:lineRule="exact" w:after="0"/>
         <w:pBdr>
           <w:bottom w:val="single" w:sz="4" w:space="1" w:color="808080"/>
+          <w:between w:val="single" w:sz="4" w:space="1" w:color="808080"/>
         </w:pBdr>
       </w:pPr>
     </w:p>
@@ -1483,6 +1416,7 @@
         <w:spacing w:line="520" w:lineRule="exact" w:after="0"/>
         <w:pBdr>
           <w:bottom w:val="single" w:sz="4" w:space="1" w:color="808080"/>
+          <w:between w:val="single" w:sz="4" w:space="1" w:color="808080"/>
         </w:pBdr>
       </w:pPr>
     </w:p>
@@ -1492,6 +1426,7 @@
         <w:spacing w:line="520" w:lineRule="exact" w:after="0"/>
         <w:pBdr>
           <w:bottom w:val="single" w:sz="4" w:space="1" w:color="808080"/>
+          <w:between w:val="single" w:sz="4" w:space="1" w:color="808080"/>
         </w:pBdr>
       </w:pPr>
     </w:p>
@@ -1501,6 +1436,7 @@
         <w:spacing w:line="520" w:lineRule="exact" w:after="0"/>
         <w:pBdr>
           <w:bottom w:val="single" w:sz="4" w:space="1" w:color="808080"/>
+          <w:between w:val="single" w:sz="4" w:space="1" w:color="808080"/>
         </w:pBdr>
       </w:pPr>
     </w:p>
@@ -1510,6 +1446,7 @@
         <w:spacing w:line="520" w:lineRule="exact" w:after="0"/>
         <w:pBdr>
           <w:bottom w:val="single" w:sz="4" w:space="1" w:color="808080"/>
+          <w:between w:val="single" w:sz="4" w:space="1" w:color="808080"/>
         </w:pBdr>
       </w:pPr>
     </w:p>
@@ -1519,6 +1456,7 @@
         <w:spacing w:line="520" w:lineRule="exact" w:after="0"/>
         <w:pBdr>
           <w:bottom w:val="single" w:sz="4" w:space="1" w:color="808080"/>
+          <w:between w:val="single" w:sz="4" w:space="1" w:color="808080"/>
         </w:pBdr>
       </w:pPr>
     </w:p>
@@ -1528,6 +1466,7 @@
         <w:spacing w:line="520" w:lineRule="exact" w:after="0"/>
         <w:pBdr>
           <w:bottom w:val="single" w:sz="4" w:space="1" w:color="808080"/>
+          <w:between w:val="single" w:sz="4" w:space="1" w:color="808080"/>
         </w:pBdr>
       </w:pPr>
     </w:p>
@@ -1537,6 +1476,7 @@
         <w:spacing w:line="520" w:lineRule="exact" w:after="0"/>
         <w:pBdr>
           <w:bottom w:val="single" w:sz="4" w:space="1" w:color="808080"/>
+          <w:between w:val="single" w:sz="4" w:space="1" w:color="808080"/>
         </w:pBdr>
       </w:pPr>
     </w:p>
@@ -1546,6 +1486,7 @@
         <w:spacing w:line="520" w:lineRule="exact" w:after="0"/>
         <w:pBdr>
           <w:bottom w:val="single" w:sz="4" w:space="1" w:color="808080"/>
+          <w:between w:val="single" w:sz="4" w:space="1" w:color="808080"/>
         </w:pBdr>
       </w:pPr>
     </w:p>
@@ -1555,6 +1496,7 @@
         <w:spacing w:line="520" w:lineRule="exact" w:after="0"/>
         <w:pBdr>
           <w:bottom w:val="single" w:sz="4" w:space="1" w:color="808080"/>
+          <w:between w:val="single" w:sz="4" w:space="1" w:color="808080"/>
         </w:pBdr>
       </w:pPr>
     </w:p>
@@ -1564,6 +1506,7 @@
         <w:spacing w:line="520" w:lineRule="exact" w:after="0"/>
         <w:pBdr>
           <w:bottom w:val="single" w:sz="4" w:space="1" w:color="808080"/>
+          <w:between w:val="single" w:sz="4" w:space="1" w:color="808080"/>
         </w:pBdr>
       </w:pPr>
     </w:p>
@@ -1573,6 +1516,7 @@
         <w:spacing w:line="520" w:lineRule="exact" w:after="0"/>
         <w:pBdr>
           <w:bottom w:val="single" w:sz="4" w:space="1" w:color="808080"/>
+          <w:between w:val="single" w:sz="4" w:space="1" w:color="808080"/>
         </w:pBdr>
       </w:pPr>
     </w:p>
@@ -1582,6 +1526,7 @@
         <w:spacing w:line="520" w:lineRule="exact" w:after="0"/>
         <w:pBdr>
           <w:bottom w:val="single" w:sz="4" w:space="1" w:color="808080"/>
+          <w:between w:val="single" w:sz="4" w:space="1" w:color="808080"/>
         </w:pBdr>
       </w:pPr>
     </w:p>
@@ -1591,6 +1536,7 @@
         <w:spacing w:line="520" w:lineRule="exact" w:after="0"/>
         <w:pBdr>
           <w:bottom w:val="single" w:sz="4" w:space="1" w:color="808080"/>
+          <w:between w:val="single" w:sz="4" w:space="1" w:color="808080"/>
         </w:pBdr>
       </w:pPr>
     </w:p>
@@ -1600,6 +1546,7 @@
         <w:spacing w:line="520" w:lineRule="exact" w:after="0"/>
         <w:pBdr>
           <w:bottom w:val="single" w:sz="4" w:space="1" w:color="808080"/>
+          <w:between w:val="single" w:sz="4" w:space="1" w:color="808080"/>
         </w:pBdr>
       </w:pPr>
     </w:p>
@@ -1609,6 +1556,7 @@
         <w:spacing w:line="520" w:lineRule="exact" w:after="0"/>
         <w:pBdr>
           <w:bottom w:val="single" w:sz="4" w:space="1" w:color="808080"/>
+          <w:between w:val="single" w:sz="4" w:space="1" w:color="808080"/>
         </w:pBdr>
       </w:pPr>
     </w:p>
@@ -1618,6 +1566,7 @@
         <w:spacing w:line="520" w:lineRule="exact" w:after="0"/>
         <w:pBdr>
           <w:bottom w:val="single" w:sz="4" w:space="1" w:color="808080"/>
+          <w:between w:val="single" w:sz="4" w:space="1" w:color="808080"/>
         </w:pBdr>
       </w:pPr>
     </w:p>
@@ -1627,6 +1576,7 @@
         <w:spacing w:line="520" w:lineRule="exact" w:after="0"/>
         <w:pBdr>
           <w:bottom w:val="single" w:sz="4" w:space="1" w:color="808080"/>
+          <w:between w:val="single" w:sz="4" w:space="1" w:color="808080"/>
         </w:pBdr>
       </w:pPr>
     </w:p>
@@ -1636,6 +1586,7 @@
         <w:spacing w:line="520" w:lineRule="exact" w:after="0"/>
         <w:pBdr>
           <w:bottom w:val="single" w:sz="4" w:space="1" w:color="808080"/>
+          <w:between w:val="single" w:sz="4" w:space="1" w:color="808080"/>
         </w:pBdr>
       </w:pPr>
     </w:p>
@@ -1645,6 +1596,7 @@
         <w:spacing w:line="520" w:lineRule="exact" w:after="0"/>
         <w:pBdr>
           <w:bottom w:val="single" w:sz="4" w:space="1" w:color="808080"/>
+          <w:between w:val="single" w:sz="4" w:space="1" w:color="808080"/>
         </w:pBdr>
       </w:pPr>
     </w:p>
@@ -1653,6 +1605,270 @@
         <w:spacing w:line="520" w:lineRule="exact" w:after="0"/>
         <w:pBdr>
           <w:bottom w:val="single" w:sz="4" w:space="1" w:color="808080"/>
+          <w:between w:val="single" w:sz="4" w:space="1" w:color="808080"/>
+        </w:pBdr>
+      </w:pPr>
+    </w:p>
+    <w:p>
+      <w:r>
+        <w:br w:type="page"/>
+      </w:r>
+    </w:p>
+    <w:p>
+      <w:pPr>
+        <w:keepNext/>
+        <w:spacing w:before="0" w:after="120"/>
+      </w:pPr>
+      <w:r>
+        <w:rPr>
+          <w:b/>
+          <w:sz w:val="25"/>
+        </w:rPr>
+        <w:t>6. Historiker förklarar Tysklands enande på olika sätt. Vissa menar att enandet inte hade skett utan Otto von Bismarck (aktörsperspektiv). Andra menar att det berodde på omständigheterna i tiden, till exempel Preussens styrka och nationalismen (strukturperspektiv). Redogör för hur Tyskland enades. Jämför sedan de två förklaringarna och motivera vilken du tycker är mest övertygande. Avsluta med att resonera om vilka konsekvenser enandet fick för Europa. Använd begreppen orsak, konsekvens, aktör och struktur i ditt svar.</w:t>
+      </w:r>
+    </w:p>
+    <w:p>
+      <w:pPr>
+        <w:keepNext/>
+        <w:spacing w:before="0" w:after="120"/>
+      </w:pPr>
+    </w:p>
+    <w:p>
+      <w:pPr>
+        <w:keepNext/>
+        <w:spacing w:line="520" w:lineRule="exact" w:after="0"/>
+        <w:pBdr>
+          <w:bottom w:val="single" w:sz="4" w:space="1" w:color="808080"/>
+          <w:between w:val="single" w:sz="4" w:space="1" w:color="808080"/>
+        </w:pBdr>
+      </w:pPr>
+    </w:p>
+    <w:p>
+      <w:pPr>
+        <w:keepNext/>
+        <w:spacing w:line="520" w:lineRule="exact" w:after="0"/>
+        <w:pBdr>
+          <w:bottom w:val="single" w:sz="4" w:space="1" w:color="808080"/>
+          <w:between w:val="single" w:sz="4" w:space="1" w:color="808080"/>
+        </w:pBdr>
+      </w:pPr>
+    </w:p>
+    <w:p>
+      <w:pPr>
+        <w:keepNext/>
+        <w:spacing w:line="520" w:lineRule="exact" w:after="0"/>
+        <w:pBdr>
+          <w:bottom w:val="single" w:sz="4" w:space="1" w:color="808080"/>
+          <w:between w:val="single" w:sz="4" w:space="1" w:color="808080"/>
+        </w:pBdr>
+      </w:pPr>
+    </w:p>
+    <w:p>
+      <w:pPr>
+        <w:keepNext/>
+        <w:spacing w:line="520" w:lineRule="exact" w:after="0"/>
+        <w:pBdr>
+          <w:bottom w:val="single" w:sz="4" w:space="1" w:color="808080"/>
+          <w:between w:val="single" w:sz="4" w:space="1" w:color="808080"/>
+        </w:pBdr>
+      </w:pPr>
+    </w:p>
+    <w:p>
+      <w:pPr>
+        <w:keepNext/>
+        <w:spacing w:line="520" w:lineRule="exact" w:after="0"/>
+        <w:pBdr>
+          <w:bottom w:val="single" w:sz="4" w:space="1" w:color="808080"/>
+          <w:between w:val="single" w:sz="4" w:space="1" w:color="808080"/>
+        </w:pBdr>
+      </w:pPr>
+    </w:p>
+    <w:p>
+      <w:pPr>
+        <w:keepNext/>
+        <w:spacing w:line="520" w:lineRule="exact" w:after="0"/>
+        <w:pBdr>
+          <w:bottom w:val="single" w:sz="4" w:space="1" w:color="808080"/>
+          <w:between w:val="single" w:sz="4" w:space="1" w:color="808080"/>
+        </w:pBdr>
+      </w:pPr>
+    </w:p>
+    <w:p>
+      <w:pPr>
+        <w:keepNext/>
+        <w:spacing w:line="520" w:lineRule="exact" w:after="0"/>
+        <w:pBdr>
+          <w:bottom w:val="single" w:sz="4" w:space="1" w:color="808080"/>
+          <w:between w:val="single" w:sz="4" w:space="1" w:color="808080"/>
+        </w:pBdr>
+      </w:pPr>
+    </w:p>
+    <w:p>
+      <w:pPr>
+        <w:keepNext/>
+        <w:spacing w:line="520" w:lineRule="exact" w:after="0"/>
+        <w:pBdr>
+          <w:bottom w:val="single" w:sz="4" w:space="1" w:color="808080"/>
+          <w:between w:val="single" w:sz="4" w:space="1" w:color="808080"/>
+        </w:pBdr>
+      </w:pPr>
+    </w:p>
+    <w:p>
+      <w:pPr>
+        <w:keepNext/>
+        <w:spacing w:line="520" w:lineRule="exact" w:after="0"/>
+        <w:pBdr>
+          <w:bottom w:val="single" w:sz="4" w:space="1" w:color="808080"/>
+          <w:between w:val="single" w:sz="4" w:space="1" w:color="808080"/>
+        </w:pBdr>
+      </w:pPr>
+    </w:p>
+    <w:p>
+      <w:pPr>
+        <w:keepNext/>
+        <w:spacing w:line="520" w:lineRule="exact" w:after="0"/>
+        <w:pBdr>
+          <w:bottom w:val="single" w:sz="4" w:space="1" w:color="808080"/>
+          <w:between w:val="single" w:sz="4" w:space="1" w:color="808080"/>
+        </w:pBdr>
+      </w:pPr>
+    </w:p>
+    <w:p>
+      <w:pPr>
+        <w:keepNext/>
+        <w:spacing w:line="520" w:lineRule="exact" w:after="0"/>
+        <w:pBdr>
+          <w:bottom w:val="single" w:sz="4" w:space="1" w:color="808080"/>
+          <w:between w:val="single" w:sz="4" w:space="1" w:color="808080"/>
+        </w:pBdr>
+      </w:pPr>
+    </w:p>
+    <w:p>
+      <w:pPr>
+        <w:keepNext/>
+        <w:spacing w:line="520" w:lineRule="exact" w:after="0"/>
+        <w:pBdr>
+          <w:bottom w:val="single" w:sz="4" w:space="1" w:color="808080"/>
+          <w:between w:val="single" w:sz="4" w:space="1" w:color="808080"/>
+        </w:pBdr>
+      </w:pPr>
+    </w:p>
+    <w:p>
+      <w:pPr>
+        <w:keepNext/>
+        <w:spacing w:line="520" w:lineRule="exact" w:after="0"/>
+        <w:pBdr>
+          <w:bottom w:val="single" w:sz="4" w:space="1" w:color="808080"/>
+          <w:between w:val="single" w:sz="4" w:space="1" w:color="808080"/>
+        </w:pBdr>
+      </w:pPr>
+    </w:p>
+    <w:p>
+      <w:pPr>
+        <w:keepNext/>
+        <w:spacing w:line="520" w:lineRule="exact" w:after="0"/>
+        <w:pBdr>
+          <w:bottom w:val="single" w:sz="4" w:space="1" w:color="808080"/>
+          <w:between w:val="single" w:sz="4" w:space="1" w:color="808080"/>
+        </w:pBdr>
+      </w:pPr>
+    </w:p>
+    <w:p>
+      <w:pPr>
+        <w:keepNext/>
+        <w:spacing w:line="520" w:lineRule="exact" w:after="0"/>
+        <w:pBdr>
+          <w:bottom w:val="single" w:sz="4" w:space="1" w:color="808080"/>
+          <w:between w:val="single" w:sz="4" w:space="1" w:color="808080"/>
+        </w:pBdr>
+      </w:pPr>
+    </w:p>
+    <w:p>
+      <w:pPr>
+        <w:keepNext/>
+        <w:spacing w:line="520" w:lineRule="exact" w:after="0"/>
+        <w:pBdr>
+          <w:bottom w:val="single" w:sz="4" w:space="1" w:color="808080"/>
+          <w:between w:val="single" w:sz="4" w:space="1" w:color="808080"/>
+        </w:pBdr>
+      </w:pPr>
+    </w:p>
+    <w:p>
+      <w:pPr>
+        <w:keepNext/>
+        <w:spacing w:line="520" w:lineRule="exact" w:after="0"/>
+        <w:pBdr>
+          <w:bottom w:val="single" w:sz="4" w:space="1" w:color="808080"/>
+          <w:between w:val="single" w:sz="4" w:space="1" w:color="808080"/>
+        </w:pBdr>
+      </w:pPr>
+    </w:p>
+    <w:p>
+      <w:pPr>
+        <w:keepNext/>
+        <w:spacing w:line="520" w:lineRule="exact" w:after="0"/>
+        <w:pBdr>
+          <w:bottom w:val="single" w:sz="4" w:space="1" w:color="808080"/>
+          <w:between w:val="single" w:sz="4" w:space="1" w:color="808080"/>
+        </w:pBdr>
+      </w:pPr>
+    </w:p>
+    <w:p>
+      <w:pPr>
+        <w:keepNext/>
+        <w:spacing w:line="520" w:lineRule="exact" w:after="0"/>
+        <w:pBdr>
+          <w:bottom w:val="single" w:sz="4" w:space="1" w:color="808080"/>
+          <w:between w:val="single" w:sz="4" w:space="1" w:color="808080"/>
+        </w:pBdr>
+      </w:pPr>
+    </w:p>
+    <w:p>
+      <w:pPr>
+        <w:keepNext/>
+        <w:spacing w:line="520" w:lineRule="exact" w:after="0"/>
+        <w:pBdr>
+          <w:bottom w:val="single" w:sz="4" w:space="1" w:color="808080"/>
+          <w:between w:val="single" w:sz="4" w:space="1" w:color="808080"/>
+        </w:pBdr>
+      </w:pPr>
+    </w:p>
+    <w:p>
+      <w:pPr>
+        <w:keepNext/>
+        <w:spacing w:line="520" w:lineRule="exact" w:after="0"/>
+        <w:pBdr>
+          <w:bottom w:val="single" w:sz="4" w:space="1" w:color="808080"/>
+          <w:between w:val="single" w:sz="4" w:space="1" w:color="808080"/>
+        </w:pBdr>
+      </w:pPr>
+    </w:p>
+    <w:p>
+      <w:pPr>
+        <w:keepNext/>
+        <w:spacing w:line="520" w:lineRule="exact" w:after="0"/>
+        <w:pBdr>
+          <w:bottom w:val="single" w:sz="4" w:space="1" w:color="808080"/>
+          <w:between w:val="single" w:sz="4" w:space="1" w:color="808080"/>
+        </w:pBdr>
+      </w:pPr>
+    </w:p>
+    <w:p>
+      <w:pPr>
+        <w:keepNext/>
+        <w:spacing w:line="520" w:lineRule="exact" w:after="0"/>
+        <w:pBdr>
+          <w:bottom w:val="single" w:sz="4" w:space="1" w:color="808080"/>
+          <w:between w:val="single" w:sz="4" w:space="1" w:color="808080"/>
+        </w:pBdr>
+      </w:pPr>
+    </w:p>
+    <w:p>
+      <w:pPr>
+        <w:spacing w:line="520" w:lineRule="exact" w:after="0"/>
+        <w:pBdr>
+          <w:bottom w:val="single" w:sz="4" w:space="1" w:color="808080"/>
+          <w:between w:val="single" w:sz="4" w:space="1" w:color="808080"/>
         </w:pBdr>
       </w:pPr>
     </w:p>

</xml_diff>

<commit_message>
Undvik att eleven skriver samma sak flera gånger
- Begreppen Konservatism, Klasskamp och L'ancien régime ersätts av Livegen,
  Upplyst despot och Reaktionär (överlappade del 3 och revolutionsfrågan)
- Revolutionsfrågans bedömningsstöd pekar inte längre på ideologierna
- Ny regel i skapa-prov och SAMMANFATTNING.md

Co-Authored-By: Claude Opus 5.5 <noreply@anthropic.com>
Claude-Session: https://claude.ai/code/session_01XK5P1PHwjc1RghiHGkL9YZ
</commit_message>
<xml_diff>
--- a/prov/det-langa-1800-talet-gy11/det-langa-1800-talet-gy11_elev.docx
+++ b/prov/det-langa-1800-talet-gy11/det-langa-1800-talet-gy11_elev.docx
@@ -932,7 +932,89 @@
         <w:rPr>
           <w:sz w:val="21"/>
         </w:rPr>
-        <w:t>L’ancien régime</w:t>
+        <w:t>Livegen</w:t>
+      </w:r>
+    </w:p>
+    <w:p>
+      <w:pPr>
+        <w:keepNext/>
+        <w:spacing w:line="520" w:lineRule="exact" w:after="0"/>
+        <w:pBdr>
+          <w:bottom w:val="single" w:sz="4" w:space="1" w:color="808080"/>
+          <w:between w:val="single" w:sz="4" w:space="1" w:color="808080"/>
+        </w:pBdr>
+      </w:pPr>
+    </w:p>
+    <w:p>
+      <w:pPr>
+        <w:spacing w:line="520" w:lineRule="exact" w:after="0"/>
+        <w:pBdr>
+          <w:bottom w:val="single" w:sz="4" w:space="1" w:color="808080"/>
+          <w:between w:val="single" w:sz="4" w:space="1" w:color="808080"/>
+        </w:pBdr>
+      </w:pPr>
+    </w:p>
+    <w:p>
+      <w:pPr>
+        <w:keepNext w:val="0"/>
+        <w:spacing w:before="0" w:after="80"/>
+      </w:pPr>
+    </w:p>
+    <w:p>
+      <w:pPr>
+        <w:keepNext/>
+        <w:spacing w:line="520" w:lineRule="exact" w:after="0"/>
+        <w:pBdr>
+          <w:bottom w:val="single" w:sz="4" w:space="1" w:color="808080"/>
+          <w:between w:val="single" w:sz="4" w:space="1" w:color="808080"/>
+        </w:pBdr>
+      </w:pPr>
+      <w:r>
+        <w:rPr>
+          <w:sz w:val="21"/>
+        </w:rPr>
+        <w:t>Upplyst despot</w:t>
+      </w:r>
+    </w:p>
+    <w:p>
+      <w:pPr>
+        <w:keepNext/>
+        <w:spacing w:line="520" w:lineRule="exact" w:after="0"/>
+        <w:pBdr>
+          <w:bottom w:val="single" w:sz="4" w:space="1" w:color="808080"/>
+          <w:between w:val="single" w:sz="4" w:space="1" w:color="808080"/>
+        </w:pBdr>
+      </w:pPr>
+    </w:p>
+    <w:p>
+      <w:pPr>
+        <w:spacing w:line="520" w:lineRule="exact" w:after="0"/>
+        <w:pBdr>
+          <w:bottom w:val="single" w:sz="4" w:space="1" w:color="808080"/>
+          <w:between w:val="single" w:sz="4" w:space="1" w:color="808080"/>
+        </w:pBdr>
+      </w:pPr>
+    </w:p>
+    <w:p>
+      <w:pPr>
+        <w:keepNext w:val="0"/>
+        <w:spacing w:before="0" w:after="80"/>
+      </w:pPr>
+    </w:p>
+    <w:p>
+      <w:pPr>
+        <w:keepNext/>
+        <w:spacing w:line="520" w:lineRule="exact" w:after="0"/>
+        <w:pBdr>
+          <w:bottom w:val="single" w:sz="4" w:space="1" w:color="808080"/>
+          <w:between w:val="single" w:sz="4" w:space="1" w:color="808080"/>
+        </w:pBdr>
+      </w:pPr>
+      <w:r>
+        <w:rPr>
+          <w:sz w:val="21"/>
+        </w:rPr>
+        <w:t>Nationalism</w:t>
       </w:r>
     </w:p>
     <w:p>
@@ -1014,89 +1096,7 @@
         <w:rPr>
           <w:sz w:val="21"/>
         </w:rPr>
-        <w:t>Konservatism</w:t>
-      </w:r>
-    </w:p>
-    <w:p>
-      <w:pPr>
-        <w:keepNext/>
-        <w:spacing w:line="520" w:lineRule="exact" w:after="0"/>
-        <w:pBdr>
-          <w:bottom w:val="single" w:sz="4" w:space="1" w:color="808080"/>
-          <w:between w:val="single" w:sz="4" w:space="1" w:color="808080"/>
-        </w:pBdr>
-      </w:pPr>
-    </w:p>
-    <w:p>
-      <w:pPr>
-        <w:spacing w:line="520" w:lineRule="exact" w:after="0"/>
-        <w:pBdr>
-          <w:bottom w:val="single" w:sz="4" w:space="1" w:color="808080"/>
-          <w:between w:val="single" w:sz="4" w:space="1" w:color="808080"/>
-        </w:pBdr>
-      </w:pPr>
-    </w:p>
-    <w:p>
-      <w:pPr>
-        <w:keepNext w:val="0"/>
-        <w:spacing w:before="0" w:after="80"/>
-      </w:pPr>
-    </w:p>
-    <w:p>
-      <w:pPr>
-        <w:keepNext/>
-        <w:spacing w:line="520" w:lineRule="exact" w:after="0"/>
-        <w:pBdr>
-          <w:bottom w:val="single" w:sz="4" w:space="1" w:color="808080"/>
-          <w:between w:val="single" w:sz="4" w:space="1" w:color="808080"/>
-        </w:pBdr>
-      </w:pPr>
-      <w:r>
-        <w:rPr>
-          <w:sz w:val="21"/>
-        </w:rPr>
-        <w:t>Nationalism</w:t>
-      </w:r>
-    </w:p>
-    <w:p>
-      <w:pPr>
-        <w:keepNext/>
-        <w:spacing w:line="520" w:lineRule="exact" w:after="0"/>
-        <w:pBdr>
-          <w:bottom w:val="single" w:sz="4" w:space="1" w:color="808080"/>
-          <w:between w:val="single" w:sz="4" w:space="1" w:color="808080"/>
-        </w:pBdr>
-      </w:pPr>
-    </w:p>
-    <w:p>
-      <w:pPr>
-        <w:spacing w:line="520" w:lineRule="exact" w:after="0"/>
-        <w:pBdr>
-          <w:bottom w:val="single" w:sz="4" w:space="1" w:color="808080"/>
-          <w:between w:val="single" w:sz="4" w:space="1" w:color="808080"/>
-        </w:pBdr>
-      </w:pPr>
-    </w:p>
-    <w:p>
-      <w:pPr>
-        <w:keepNext w:val="0"/>
-        <w:spacing w:before="0" w:after="80"/>
-      </w:pPr>
-    </w:p>
-    <w:p>
-      <w:pPr>
-        <w:keepNext/>
-        <w:spacing w:line="520" w:lineRule="exact" w:after="0"/>
-        <w:pBdr>
-          <w:bottom w:val="single" w:sz="4" w:space="1" w:color="808080"/>
-          <w:between w:val="single" w:sz="4" w:space="1" w:color="808080"/>
-        </w:pBdr>
-      </w:pPr>
-      <w:r>
-        <w:rPr>
-          <w:sz w:val="21"/>
-        </w:rPr>
-        <w:t>Klasskamp</w:t>
+        <w:t>Reaktionär</w:t>
       </w:r>
     </w:p>
     <w:p>

</xml_diff>